<commit_message>
Add QR links for all ten practice tasks
</commit_message>
<xml_diff>
--- a/docs/assignment.docx
+++ b/docs/assignment.docx
@@ -2695,6 +2695,912 @@
         <w:t>(подпись студента)</w:t>
       </w:r>
     </w:p>
+    <w:p>
+      <w:r>
+        <w:br w:type="page"/>
+      </w:r>
+    </w:p>
+    <w:p>
+      <w:pPr>
+        <w:spacing w:after="100"/>
+      </w:pPr>
+      <w:r>
+        <w:rPr>
+          <w:rFonts w:ascii="Times New Roman" w:hAnsi="Times New Roman"/>
+          <w:b/>
+          <w:color w:val="000000"/>
+          <w:sz w:val="26"/>
+        </w:rPr>
+        <w:t>Приложение. QR-коды материалов по заданиям</w:t>
+      </w:r>
+    </w:p>
+    <w:p>
+      <w:pPr>
+        <w:spacing w:after="40"/>
+      </w:pPr>
+      <w:r>
+        <w:rPr>
+          <w:rFonts w:ascii="Times New Roman" w:hAnsi="Times New Roman"/>
+          <w:b w:val="0"/>
+          <w:sz w:val="18"/>
+        </w:rPr>
+        <w:t>Каждый QR-код открывает страницу соответствующего задания с результатом и подтверждающими материалами.</w:t>
+      </w:r>
+    </w:p>
+    <w:p>
+      <w:pPr>
+        <w:spacing w:after="140"/>
+      </w:pPr>
+      <w:r>
+        <w:rPr>
+          <w:rFonts w:ascii="Times New Roman" w:hAnsi="Times New Roman"/>
+          <w:b w:val="0"/>
+          <w:color w:val="3C3C3C"/>
+          <w:sz w:val="16"/>
+        </w:rPr>
+        <w:t>https://github.com/AndrewCaulaincourt/practice-2026-course-2</w:t>
+      </w:r>
+    </w:p>
+    <w:tbl>
+      <w:tblPr>
+        <w:tblW w:type="auto" w:w="0"/>
+        <w:jc w:val="center"/>
+        <w:tblLayout w:type="fixed"/>
+        <w:tblLook w:firstColumn="1" w:firstRow="1" w:lastColumn="0" w:lastRow="0" w:noHBand="0" w:noVBand="1" w:val="04A0"/>
+        <w:tblBorders>
+          <w:top w:val="single" w:sz="4" w:color="D9D9D9"/>
+          <w:left w:val="single" w:sz="4" w:color="D9D9D9"/>
+          <w:bottom w:val="single" w:sz="4" w:color="D9D9D9"/>
+          <w:right w:val="single" w:sz="4" w:color="D9D9D9"/>
+          <w:insideH w:val="single" w:sz="4" w:color="D9D9D9"/>
+          <w:insideV w:val="single" w:sz="4" w:color="D9D9D9"/>
+        </w:tblBorders>
+      </w:tblPr>
+      <w:tblGrid>
+        <w:gridCol w:w="4960"/>
+        <w:gridCol w:w="4960"/>
+      </w:tblGrid>
+      <w:tr>
+        <w:trPr>
+          <w:trHeight w:val="2013" w:hRule="atLeast"/>
+          <w:cantSplit/>
+        </w:trPr>
+        <w:tc>
+          <w:tcPr>
+            <w:tcW w:type="dxa" w:w="4960"/>
+            <w:vAlign w:val="center"/>
+            <w:tcMar>
+              <w:top w:w="100" w:type="dxa"/>
+              <w:start w:w="90" w:type="dxa"/>
+              <w:bottom w:w="100" w:type="dxa"/>
+              <w:end w:w="90" w:type="dxa"/>
+            </w:tcMar>
+          </w:tcPr>
+          <w:p>
+            <w:pPr>
+              <w:spacing w:after="0"/>
+              <w:jc w:val="center"/>
+            </w:pPr>
+            <w:r>
+              <w:drawing>
+                <wp:inline xmlns:a="http://schemas.openxmlformats.org/drawingml/2006/main" xmlns:pic="http://schemas.openxmlformats.org/drawingml/2006/picture">
+                  <wp:extent cx="917999" cy="917999"/>
+                  <wp:docPr id="1" name="Picture 1"/>
+                  <wp:cNvGraphicFramePr>
+                    <a:graphicFrameLocks noChangeAspect="1"/>
+                  </wp:cNvGraphicFramePr>
+                  <a:graphic>
+                    <a:graphicData uri="http://schemas.openxmlformats.org/drawingml/2006/picture">
+                      <pic:pic>
+                        <pic:nvPicPr>
+                          <pic:cNvPr id="0" name="task-1.1.png"/>
+                          <pic:cNvPicPr/>
+                        </pic:nvPicPr>
+                        <pic:blipFill>
+                          <a:blip r:embed="rId7"/>
+                          <a:stretch>
+                            <a:fillRect/>
+                          </a:stretch>
+                        </pic:blipFill>
+                        <pic:spPr>
+                          <a:xfrm>
+                            <a:off x="0" y="0"/>
+                            <a:ext cx="917999" cy="917999"/>
+                          </a:xfrm>
+                          <a:prstGeom prst="rect"/>
+                        </pic:spPr>
+                      </pic:pic>
+                    </a:graphicData>
+                  </a:graphic>
+                </wp:inline>
+              </w:drawing>
+            </w:r>
+          </w:p>
+          <w:p>
+            <w:pPr>
+              <w:spacing w:after="0"/>
+              <w:jc w:val="center"/>
+            </w:pPr>
+            <w:r>
+              <w:rPr>
+                <w:rFonts w:ascii="Times New Roman" w:hAnsi="Times New Roman"/>
+                <w:b/>
+                <w:sz w:val="18"/>
+              </w:rPr>
+              <w:t>1.1  Аудиослои и варианты</w:t>
+            </w:r>
+          </w:p>
+          <w:p>
+            <w:pPr>
+              <w:spacing w:after="0"/>
+              <w:jc w:val="center"/>
+            </w:pPr>
+            <w:r>
+              <w:rPr>
+                <w:rFonts w:ascii="Times New Roman" w:hAnsi="Times New Roman"/>
+                <w:b w:val="0"/>
+                <w:color w:val="5A5A5A"/>
+                <w:sz w:val="15"/>
+              </w:rPr>
+              <w:t>evidence/tasks/1.1.md</w:t>
+            </w:r>
+          </w:p>
+        </w:tc>
+        <w:tc>
+          <w:tcPr>
+            <w:tcW w:type="dxa" w:w="4960"/>
+            <w:vAlign w:val="center"/>
+            <w:tcMar>
+              <w:top w:w="100" w:type="dxa"/>
+              <w:start w:w="90" w:type="dxa"/>
+              <w:bottom w:w="100" w:type="dxa"/>
+              <w:end w:w="90" w:type="dxa"/>
+            </w:tcMar>
+          </w:tcPr>
+          <w:p>
+            <w:pPr>
+              <w:spacing w:after="0"/>
+              <w:jc w:val="center"/>
+            </w:pPr>
+            <w:r>
+              <w:drawing>
+                <wp:inline xmlns:a="http://schemas.openxmlformats.org/drawingml/2006/main" xmlns:pic="http://schemas.openxmlformats.org/drawingml/2006/picture">
+                  <wp:extent cx="917999" cy="917999"/>
+                  <wp:docPr id="2" name="Picture 2"/>
+                  <wp:cNvGraphicFramePr>
+                    <a:graphicFrameLocks noChangeAspect="1"/>
+                  </wp:cNvGraphicFramePr>
+                  <a:graphic>
+                    <a:graphicData uri="http://schemas.openxmlformats.org/drawingml/2006/picture">
+                      <pic:pic>
+                        <pic:nvPicPr>
+                          <pic:cNvPr id="0" name="task-1.2.png"/>
+                          <pic:cNvPicPr/>
+                        </pic:nvPicPr>
+                        <pic:blipFill>
+                          <a:blip r:embed="rId8"/>
+                          <a:stretch>
+                            <a:fillRect/>
+                          </a:stretch>
+                        </pic:blipFill>
+                        <pic:spPr>
+                          <a:xfrm>
+                            <a:off x="0" y="0"/>
+                            <a:ext cx="917999" cy="917999"/>
+                          </a:xfrm>
+                          <a:prstGeom prst="rect"/>
+                        </pic:spPr>
+                      </pic:pic>
+                    </a:graphicData>
+                  </a:graphic>
+                </wp:inline>
+              </w:drawing>
+            </w:r>
+          </w:p>
+          <w:p>
+            <w:pPr>
+              <w:spacing w:after="0"/>
+              <w:jc w:val="center"/>
+            </w:pPr>
+            <w:r>
+              <w:rPr>
+                <w:rFonts w:ascii="Times New Roman" w:hAnsi="Times New Roman"/>
+                <w:b/>
+                <w:sz w:val="18"/>
+              </w:rPr>
+              <w:t>1.2  Подготовка слоёв к микшированию</w:t>
+            </w:r>
+          </w:p>
+          <w:p>
+            <w:pPr>
+              <w:spacing w:after="0"/>
+              <w:jc w:val="center"/>
+            </w:pPr>
+            <w:r>
+              <w:rPr>
+                <w:rFonts w:ascii="Times New Roman" w:hAnsi="Times New Roman"/>
+                <w:b w:val="0"/>
+                <w:color w:val="5A5A5A"/>
+                <w:sz w:val="15"/>
+              </w:rPr>
+              <w:t>evidence/tasks/1.2.md</w:t>
+            </w:r>
+          </w:p>
+        </w:tc>
+      </w:tr>
+      <w:tr>
+        <w:trPr>
+          <w:trHeight w:val="2013" w:hRule="atLeast"/>
+          <w:cantSplit/>
+        </w:trPr>
+        <w:tc>
+          <w:tcPr>
+            <w:tcW w:type="dxa" w:w="4960"/>
+            <w:vAlign w:val="center"/>
+            <w:tcMar>
+              <w:top w:w="100" w:type="dxa"/>
+              <w:start w:w="90" w:type="dxa"/>
+              <w:bottom w:w="100" w:type="dxa"/>
+              <w:end w:w="90" w:type="dxa"/>
+            </w:tcMar>
+          </w:tcPr>
+          <w:p>
+            <w:pPr>
+              <w:spacing w:after="0"/>
+              <w:jc w:val="center"/>
+            </w:pPr>
+            <w:r>
+              <w:drawing>
+                <wp:inline xmlns:a="http://schemas.openxmlformats.org/drawingml/2006/main" xmlns:pic="http://schemas.openxmlformats.org/drawingml/2006/picture">
+                  <wp:extent cx="917999" cy="917999"/>
+                  <wp:docPr id="3" name="Picture 3"/>
+                  <wp:cNvGraphicFramePr>
+                    <a:graphicFrameLocks noChangeAspect="1"/>
+                  </wp:cNvGraphicFramePr>
+                  <a:graphic>
+                    <a:graphicData uri="http://schemas.openxmlformats.org/drawingml/2006/picture">
+                      <pic:pic>
+                        <pic:nvPicPr>
+                          <pic:cNvPr id="0" name="task-1.3.png"/>
+                          <pic:cNvPicPr/>
+                        </pic:nvPicPr>
+                        <pic:blipFill>
+                          <a:blip r:embed="rId9"/>
+                          <a:stretch>
+                            <a:fillRect/>
+                          </a:stretch>
+                        </pic:blipFill>
+                        <pic:spPr>
+                          <a:xfrm>
+                            <a:off x="0" y="0"/>
+                            <a:ext cx="917999" cy="917999"/>
+                          </a:xfrm>
+                          <a:prstGeom prst="rect"/>
+                        </pic:spPr>
+                      </pic:pic>
+                    </a:graphicData>
+                  </a:graphic>
+                </wp:inline>
+              </w:drawing>
+            </w:r>
+          </w:p>
+          <w:p>
+            <w:pPr>
+              <w:spacing w:after="0"/>
+              <w:jc w:val="center"/>
+            </w:pPr>
+            <w:r>
+              <w:rPr>
+                <w:rFonts w:ascii="Times New Roman" w:hAnsi="Times New Roman"/>
+                <w:b/>
+                <w:sz w:val="18"/>
+              </w:rPr>
+              <w:t>1.3  Подключение наборов к сценам</w:t>
+            </w:r>
+          </w:p>
+          <w:p>
+            <w:pPr>
+              <w:spacing w:after="0"/>
+              <w:jc w:val="center"/>
+            </w:pPr>
+            <w:r>
+              <w:rPr>
+                <w:rFonts w:ascii="Times New Roman" w:hAnsi="Times New Roman"/>
+                <w:b w:val="0"/>
+                <w:color w:val="5A5A5A"/>
+                <w:sz w:val="15"/>
+              </w:rPr>
+              <w:t>evidence/tasks/1.3.md</w:t>
+            </w:r>
+          </w:p>
+        </w:tc>
+        <w:tc>
+          <w:tcPr>
+            <w:tcW w:type="dxa" w:w="4960"/>
+            <w:vAlign w:val="center"/>
+            <w:tcMar>
+              <w:top w:w="100" w:type="dxa"/>
+              <w:start w:w="90" w:type="dxa"/>
+              <w:bottom w:w="100" w:type="dxa"/>
+              <w:end w:w="90" w:type="dxa"/>
+            </w:tcMar>
+          </w:tcPr>
+          <w:p>
+            <w:pPr>
+              <w:spacing w:after="0"/>
+              <w:jc w:val="center"/>
+            </w:pPr>
+            <w:r>
+              <w:drawing>
+                <wp:inline xmlns:a="http://schemas.openxmlformats.org/drawingml/2006/main" xmlns:pic="http://schemas.openxmlformats.org/drawingml/2006/picture">
+                  <wp:extent cx="917999" cy="917999"/>
+                  <wp:docPr id="4" name="Picture 4"/>
+                  <wp:cNvGraphicFramePr>
+                    <a:graphicFrameLocks noChangeAspect="1"/>
+                  </wp:cNvGraphicFramePr>
+                  <a:graphic>
+                    <a:graphicData uri="http://schemas.openxmlformats.org/drawingml/2006/picture">
+                      <pic:pic>
+                        <pic:nvPicPr>
+                          <pic:cNvPr id="0" name="task-2.1.png"/>
+                          <pic:cNvPicPr/>
+                        </pic:nvPicPr>
+                        <pic:blipFill>
+                          <a:blip r:embed="rId10"/>
+                          <a:stretch>
+                            <a:fillRect/>
+                          </a:stretch>
+                        </pic:blipFill>
+                        <pic:spPr>
+                          <a:xfrm>
+                            <a:off x="0" y="0"/>
+                            <a:ext cx="917999" cy="917999"/>
+                          </a:xfrm>
+                          <a:prstGeom prst="rect"/>
+                        </pic:spPr>
+                      </pic:pic>
+                    </a:graphicData>
+                  </a:graphic>
+                </wp:inline>
+              </w:drawing>
+            </w:r>
+          </w:p>
+          <w:p>
+            <w:pPr>
+              <w:spacing w:after="0"/>
+              <w:jc w:val="center"/>
+            </w:pPr>
+            <w:r>
+              <w:rPr>
+                <w:rFonts w:ascii="Times New Roman" w:hAnsi="Times New Roman"/>
+                <w:b/>
+                <w:sz w:val="18"/>
+              </w:rPr>
+              <w:t>2.1  Параметры аудиодвижка</w:t>
+            </w:r>
+          </w:p>
+          <w:p>
+            <w:pPr>
+              <w:spacing w:after="0"/>
+              <w:jc w:val="center"/>
+            </w:pPr>
+            <w:r>
+              <w:rPr>
+                <w:rFonts w:ascii="Times New Roman" w:hAnsi="Times New Roman"/>
+                <w:b w:val="0"/>
+                <w:color w:val="5A5A5A"/>
+                <w:sz w:val="15"/>
+              </w:rPr>
+              <w:t>evidence/tasks/2.1.md</w:t>
+            </w:r>
+          </w:p>
+        </w:tc>
+      </w:tr>
+      <w:tr>
+        <w:trPr>
+          <w:trHeight w:val="2013" w:hRule="atLeast"/>
+          <w:cantSplit/>
+        </w:trPr>
+        <w:tc>
+          <w:tcPr>
+            <w:tcW w:type="dxa" w:w="4960"/>
+            <w:vAlign w:val="center"/>
+            <w:tcMar>
+              <w:top w:w="100" w:type="dxa"/>
+              <w:start w:w="90" w:type="dxa"/>
+              <w:bottom w:w="100" w:type="dxa"/>
+              <w:end w:w="90" w:type="dxa"/>
+            </w:tcMar>
+          </w:tcPr>
+          <w:p>
+            <w:pPr>
+              <w:spacing w:after="0"/>
+              <w:jc w:val="center"/>
+            </w:pPr>
+            <w:r>
+              <w:drawing>
+                <wp:inline xmlns:a="http://schemas.openxmlformats.org/drawingml/2006/main" xmlns:pic="http://schemas.openxmlformats.org/drawingml/2006/picture">
+                  <wp:extent cx="917999" cy="917999"/>
+                  <wp:docPr id="5" name="Picture 5"/>
+                  <wp:cNvGraphicFramePr>
+                    <a:graphicFrameLocks noChangeAspect="1"/>
+                  </wp:cNvGraphicFramePr>
+                  <a:graphic>
+                    <a:graphicData uri="http://schemas.openxmlformats.org/drawingml/2006/picture">
+                      <pic:pic>
+                        <pic:nvPicPr>
+                          <pic:cNvPr id="0" name="task-2.2.png"/>
+                          <pic:cNvPicPr/>
+                        </pic:nvPicPr>
+                        <pic:blipFill>
+                          <a:blip r:embed="rId11"/>
+                          <a:stretch>
+                            <a:fillRect/>
+                          </a:stretch>
+                        </pic:blipFill>
+                        <pic:spPr>
+                          <a:xfrm>
+                            <a:off x="0" y="0"/>
+                            <a:ext cx="917999" cy="917999"/>
+                          </a:xfrm>
+                          <a:prstGeom prst="rect"/>
+                        </pic:spPr>
+                      </pic:pic>
+                    </a:graphicData>
+                  </a:graphic>
+                </wp:inline>
+              </w:drawing>
+            </w:r>
+          </w:p>
+          <w:p>
+            <w:pPr>
+              <w:spacing w:after="0"/>
+              <w:jc w:val="center"/>
+            </w:pPr>
+            <w:r>
+              <w:rPr>
+                <w:rFonts w:ascii="Times New Roman" w:hAnsi="Times New Roman"/>
+                <w:b/>
+                <w:sz w:val="18"/>
+              </w:rPr>
+              <w:t>2.2  Циклы и плавные переходы</w:t>
+            </w:r>
+          </w:p>
+          <w:p>
+            <w:pPr>
+              <w:spacing w:after="0"/>
+              <w:jc w:val="center"/>
+            </w:pPr>
+            <w:r>
+              <w:rPr>
+                <w:rFonts w:ascii="Times New Roman" w:hAnsi="Times New Roman"/>
+                <w:b w:val="0"/>
+                <w:color w:val="5A5A5A"/>
+                <w:sz w:val="15"/>
+              </w:rPr>
+              <w:t>evidence/tasks/2.2.md</w:t>
+            </w:r>
+          </w:p>
+        </w:tc>
+        <w:tc>
+          <w:tcPr>
+            <w:tcW w:type="dxa" w:w="4960"/>
+            <w:vAlign w:val="center"/>
+            <w:tcMar>
+              <w:top w:w="100" w:type="dxa"/>
+              <w:start w:w="90" w:type="dxa"/>
+              <w:bottom w:w="100" w:type="dxa"/>
+              <w:end w:w="90" w:type="dxa"/>
+            </w:tcMar>
+          </w:tcPr>
+          <w:p>
+            <w:pPr>
+              <w:spacing w:after="0"/>
+              <w:jc w:val="center"/>
+            </w:pPr>
+            <w:r>
+              <w:drawing>
+                <wp:inline xmlns:a="http://schemas.openxmlformats.org/drawingml/2006/main" xmlns:pic="http://schemas.openxmlformats.org/drawingml/2006/picture">
+                  <wp:extent cx="917999" cy="917999"/>
+                  <wp:docPr id="6" name="Picture 6"/>
+                  <wp:cNvGraphicFramePr>
+                    <a:graphicFrameLocks noChangeAspect="1"/>
+                  </wp:cNvGraphicFramePr>
+                  <a:graphic>
+                    <a:graphicData uri="http://schemas.openxmlformats.org/drawingml/2006/picture">
+                      <pic:pic>
+                        <pic:nvPicPr>
+                          <pic:cNvPr id="0" name="task-3.1.png"/>
+                          <pic:cNvPicPr/>
+                        </pic:nvPicPr>
+                        <pic:blipFill>
+                          <a:blip r:embed="rId12"/>
+                          <a:stretch>
+                            <a:fillRect/>
+                          </a:stretch>
+                        </pic:blipFill>
+                        <pic:spPr>
+                          <a:xfrm>
+                            <a:off x="0" y="0"/>
+                            <a:ext cx="917999" cy="917999"/>
+                          </a:xfrm>
+                          <a:prstGeom prst="rect"/>
+                        </pic:spPr>
+                      </pic:pic>
+                    </a:graphicData>
+                  </a:graphic>
+                </wp:inline>
+              </w:drawing>
+            </w:r>
+          </w:p>
+          <w:p>
+            <w:pPr>
+              <w:spacing w:after="0"/>
+              <w:jc w:val="center"/>
+            </w:pPr>
+            <w:r>
+              <w:rPr>
+                <w:rFonts w:ascii="Times New Roman" w:hAnsi="Times New Roman"/>
+                <w:b/>
+                <w:sz w:val="18"/>
+              </w:rPr>
+              <w:t>3.1  Маршрут «Мой микс»</w:t>
+            </w:r>
+          </w:p>
+          <w:p>
+            <w:pPr>
+              <w:spacing w:after="0"/>
+              <w:jc w:val="center"/>
+            </w:pPr>
+            <w:r>
+              <w:rPr>
+                <w:rFonts w:ascii="Times New Roman" w:hAnsi="Times New Roman"/>
+                <w:b w:val="0"/>
+                <w:color w:val="5A5A5A"/>
+                <w:sz w:val="15"/>
+              </w:rPr>
+              <w:t>evidence/tasks/3.1.md</w:t>
+            </w:r>
+          </w:p>
+        </w:tc>
+      </w:tr>
+      <w:tr>
+        <w:trPr>
+          <w:trHeight w:val="2013" w:hRule="atLeast"/>
+          <w:cantSplit/>
+        </w:trPr>
+        <w:tc>
+          <w:tcPr>
+            <w:tcW w:type="dxa" w:w="4960"/>
+            <w:vAlign w:val="center"/>
+            <w:tcMar>
+              <w:top w:w="100" w:type="dxa"/>
+              <w:start w:w="90" w:type="dxa"/>
+              <w:bottom w:w="100" w:type="dxa"/>
+              <w:end w:w="90" w:type="dxa"/>
+            </w:tcMar>
+          </w:tcPr>
+          <w:p>
+            <w:pPr>
+              <w:spacing w:after="0"/>
+              <w:jc w:val="center"/>
+            </w:pPr>
+            <w:r>
+              <w:drawing>
+                <wp:inline xmlns:a="http://schemas.openxmlformats.org/drawingml/2006/main" xmlns:pic="http://schemas.openxmlformats.org/drawingml/2006/picture">
+                  <wp:extent cx="917999" cy="917999"/>
+                  <wp:docPr id="7" name="Picture 7"/>
+                  <wp:cNvGraphicFramePr>
+                    <a:graphicFrameLocks noChangeAspect="1"/>
+                  </wp:cNvGraphicFramePr>
+                  <a:graphic>
+                    <a:graphicData uri="http://schemas.openxmlformats.org/drawingml/2006/picture">
+                      <pic:pic>
+                        <pic:nvPicPr>
+                          <pic:cNvPr id="0" name="task-3.2.png"/>
+                          <pic:cNvPicPr/>
+                        </pic:nvPicPr>
+                        <pic:blipFill>
+                          <a:blip r:embed="rId13"/>
+                          <a:stretch>
+                            <a:fillRect/>
+                          </a:stretch>
+                        </pic:blipFill>
+                        <pic:spPr>
+                          <a:xfrm>
+                            <a:off x="0" y="0"/>
+                            <a:ext cx="917999" cy="917999"/>
+                          </a:xfrm>
+                          <a:prstGeom prst="rect"/>
+                        </pic:spPr>
+                      </pic:pic>
+                    </a:graphicData>
+                  </a:graphic>
+                </wp:inline>
+              </w:drawing>
+            </w:r>
+          </w:p>
+          <w:p>
+            <w:pPr>
+              <w:spacing w:after="0"/>
+              <w:jc w:val="center"/>
+            </w:pPr>
+            <w:r>
+              <w:rPr>
+                <w:rFonts w:ascii="Times New Roman" w:hAnsi="Times New Roman"/>
+                <w:b/>
+                <w:sz w:val="18"/>
+              </w:rPr>
+              <w:t>3.2  Применение пользовательского микса</w:t>
+            </w:r>
+          </w:p>
+          <w:p>
+            <w:pPr>
+              <w:spacing w:after="0"/>
+              <w:jc w:val="center"/>
+            </w:pPr>
+            <w:r>
+              <w:rPr>
+                <w:rFonts w:ascii="Times New Roman" w:hAnsi="Times New Roman"/>
+                <w:b w:val="0"/>
+                <w:color w:val="5A5A5A"/>
+                <w:sz w:val="15"/>
+              </w:rPr>
+              <w:t>evidence/tasks/3.2.md</w:t>
+            </w:r>
+          </w:p>
+        </w:tc>
+        <w:tc>
+          <w:tcPr>
+            <w:tcW w:type="dxa" w:w="4960"/>
+            <w:vAlign w:val="center"/>
+            <w:tcMar>
+              <w:top w:w="100" w:type="dxa"/>
+              <w:start w:w="90" w:type="dxa"/>
+              <w:bottom w:w="100" w:type="dxa"/>
+              <w:end w:w="90" w:type="dxa"/>
+            </w:tcMar>
+          </w:tcPr>
+          <w:p>
+            <w:pPr>
+              <w:spacing w:after="0"/>
+              <w:jc w:val="center"/>
+            </w:pPr>
+            <w:r>
+              <w:drawing>
+                <wp:inline xmlns:a="http://schemas.openxmlformats.org/drawingml/2006/main" xmlns:pic="http://schemas.openxmlformats.org/drawingml/2006/picture">
+                  <wp:extent cx="917999" cy="917999"/>
+                  <wp:docPr id="8" name="Picture 8"/>
+                  <wp:cNvGraphicFramePr>
+                    <a:graphicFrameLocks noChangeAspect="1"/>
+                  </wp:cNvGraphicFramePr>
+                  <a:graphic>
+                    <a:graphicData uri="http://schemas.openxmlformats.org/drawingml/2006/picture">
+                      <pic:pic>
+                        <pic:nvPicPr>
+                          <pic:cNvPr id="0" name="task-3.3.png"/>
+                          <pic:cNvPicPr/>
+                        </pic:nvPicPr>
+                        <pic:blipFill>
+                          <a:blip r:embed="rId14"/>
+                          <a:stretch>
+                            <a:fillRect/>
+                          </a:stretch>
+                        </pic:blipFill>
+                        <pic:spPr>
+                          <a:xfrm>
+                            <a:off x="0" y="0"/>
+                            <a:ext cx="917999" cy="917999"/>
+                          </a:xfrm>
+                          <a:prstGeom prst="rect"/>
+                        </pic:spPr>
+                      </pic:pic>
+                    </a:graphicData>
+                  </a:graphic>
+                </wp:inline>
+              </w:drawing>
+            </w:r>
+          </w:p>
+          <w:p>
+            <w:pPr>
+              <w:spacing w:after="0"/>
+              <w:jc w:val="center"/>
+            </w:pPr>
+            <w:r>
+              <w:rPr>
+                <w:rFonts w:ascii="Times New Roman" w:hAnsi="Times New Roman"/>
+                <w:b/>
+                <w:sz w:val="18"/>
+              </w:rPr>
+              <w:t>3.3  Предпрослушивание и сохранение</w:t>
+            </w:r>
+          </w:p>
+          <w:p>
+            <w:pPr>
+              <w:spacing w:after="0"/>
+              <w:jc w:val="center"/>
+            </w:pPr>
+            <w:r>
+              <w:rPr>
+                <w:rFonts w:ascii="Times New Roman" w:hAnsi="Times New Roman"/>
+                <w:b w:val="0"/>
+                <w:color w:val="5A5A5A"/>
+                <w:sz w:val="15"/>
+              </w:rPr>
+              <w:t>evidence/tasks/3.3.md</w:t>
+            </w:r>
+          </w:p>
+        </w:tc>
+      </w:tr>
+      <w:tr>
+        <w:trPr>
+          <w:trHeight w:val="2013" w:hRule="atLeast"/>
+          <w:cantSplit/>
+        </w:trPr>
+        <w:tc>
+          <w:tcPr>
+            <w:tcW w:type="dxa" w:w="4960"/>
+            <w:vAlign w:val="center"/>
+            <w:tcMar>
+              <w:top w:w="100" w:type="dxa"/>
+              <w:start w:w="90" w:type="dxa"/>
+              <w:bottom w:w="100" w:type="dxa"/>
+              <w:end w:w="90" w:type="dxa"/>
+            </w:tcMar>
+          </w:tcPr>
+          <w:p>
+            <w:pPr>
+              <w:spacing w:after="0"/>
+              <w:jc w:val="center"/>
+            </w:pPr>
+            <w:r>
+              <w:drawing>
+                <wp:inline xmlns:a="http://schemas.openxmlformats.org/drawingml/2006/main" xmlns:pic="http://schemas.openxmlformats.org/drawingml/2006/picture">
+                  <wp:extent cx="917999" cy="917999"/>
+                  <wp:docPr id="9" name="Picture 9"/>
+                  <wp:cNvGraphicFramePr>
+                    <a:graphicFrameLocks noChangeAspect="1"/>
+                  </wp:cNvGraphicFramePr>
+                  <a:graphic>
+                    <a:graphicData uri="http://schemas.openxmlformats.org/drawingml/2006/picture">
+                      <pic:pic>
+                        <pic:nvPicPr>
+                          <pic:cNvPr id="0" name="task-4.1.png"/>
+                          <pic:cNvPicPr/>
+                        </pic:nvPicPr>
+                        <pic:blipFill>
+                          <a:blip r:embed="rId15"/>
+                          <a:stretch>
+                            <a:fillRect/>
+                          </a:stretch>
+                        </pic:blipFill>
+                        <pic:spPr>
+                          <a:xfrm>
+                            <a:off x="0" y="0"/>
+                            <a:ext cx="917999" cy="917999"/>
+                          </a:xfrm>
+                          <a:prstGeom prst="rect"/>
+                        </pic:spPr>
+                      </pic:pic>
+                    </a:graphicData>
+                  </a:graphic>
+                </wp:inline>
+              </w:drawing>
+            </w:r>
+          </w:p>
+          <w:p>
+            <w:pPr>
+              <w:spacing w:after="0"/>
+              <w:jc w:val="center"/>
+            </w:pPr>
+            <w:r>
+              <w:rPr>
+                <w:rFonts w:ascii="Times New Roman" w:hAnsi="Times New Roman"/>
+                <w:b/>
+                <w:sz w:val="18"/>
+              </w:rPr>
+              <w:t>4.1  Каталог «Сценариев»</w:t>
+            </w:r>
+          </w:p>
+          <w:p>
+            <w:pPr>
+              <w:spacing w:after="0"/>
+              <w:jc w:val="center"/>
+            </w:pPr>
+            <w:r>
+              <w:rPr>
+                <w:rFonts w:ascii="Times New Roman" w:hAnsi="Times New Roman"/>
+                <w:b w:val="0"/>
+                <w:color w:val="5A5A5A"/>
+                <w:sz w:val="15"/>
+              </w:rPr>
+              <w:t>evidence/tasks/4.1.md</w:t>
+            </w:r>
+          </w:p>
+        </w:tc>
+        <w:tc>
+          <w:tcPr>
+            <w:tcW w:type="dxa" w:w="4960"/>
+            <w:vAlign w:val="center"/>
+            <w:tcMar>
+              <w:top w:w="100" w:type="dxa"/>
+              <w:start w:w="90" w:type="dxa"/>
+              <w:bottom w:w="100" w:type="dxa"/>
+              <w:end w:w="90" w:type="dxa"/>
+            </w:tcMar>
+          </w:tcPr>
+          <w:p>
+            <w:pPr>
+              <w:spacing w:after="0"/>
+              <w:jc w:val="center"/>
+            </w:pPr>
+            <w:r>
+              <w:drawing>
+                <wp:inline xmlns:a="http://schemas.openxmlformats.org/drawingml/2006/main" xmlns:pic="http://schemas.openxmlformats.org/drawingml/2006/picture">
+                  <wp:extent cx="917999" cy="917999"/>
+                  <wp:docPr id="10" name="Picture 10"/>
+                  <wp:cNvGraphicFramePr>
+                    <a:graphicFrameLocks noChangeAspect="1"/>
+                  </wp:cNvGraphicFramePr>
+                  <a:graphic>
+                    <a:graphicData uri="http://schemas.openxmlformats.org/drawingml/2006/picture">
+                      <pic:pic>
+                        <pic:nvPicPr>
+                          <pic:cNvPr id="0" name="task-4.2.png"/>
+                          <pic:cNvPicPr/>
+                        </pic:nvPicPr>
+                        <pic:blipFill>
+                          <a:blip r:embed="rId16"/>
+                          <a:stretch>
+                            <a:fillRect/>
+                          </a:stretch>
+                        </pic:blipFill>
+                        <pic:spPr>
+                          <a:xfrm>
+                            <a:off x="0" y="0"/>
+                            <a:ext cx="917999" cy="917999"/>
+                          </a:xfrm>
+                          <a:prstGeom prst="rect"/>
+                        </pic:spPr>
+                      </pic:pic>
+                    </a:graphicData>
+                  </a:graphic>
+                </wp:inline>
+              </w:drawing>
+            </w:r>
+          </w:p>
+          <w:p>
+            <w:pPr>
+              <w:spacing w:after="0"/>
+              <w:jc w:val="center"/>
+            </w:pPr>
+            <w:r>
+              <w:rPr>
+                <w:rFonts w:ascii="Times New Roman" w:hAnsi="Times New Roman"/>
+                <w:b/>
+                <w:sz w:val="18"/>
+              </w:rPr>
+              <w:t>4.2  Этапы и переходы сценария</w:t>
+            </w:r>
+          </w:p>
+          <w:p>
+            <w:pPr>
+              <w:spacing w:after="0"/>
+              <w:jc w:val="center"/>
+            </w:pPr>
+            <w:r>
+              <w:rPr>
+                <w:rFonts w:ascii="Times New Roman" w:hAnsi="Times New Roman"/>
+                <w:b w:val="0"/>
+                <w:color w:val="5A5A5A"/>
+                <w:sz w:val="15"/>
+              </w:rPr>
+              <w:t>evidence/tasks/4.2.md</w:t>
+            </w:r>
+          </w:p>
+        </w:tc>
+      </w:tr>
+    </w:tbl>
     <w:sectPr>
       <w:pgSz w:w="11906" w:h="16838"/>
       <w:pgMar w:top="851" w:right="851" w:bottom="851" w:left="1134" w:header="709" w:footer="709" w:gutter="0"/>

</xml_diff>